<commit_message>
docs: use bracket-free placeholders (ACCOUNT_ID/OPERATOR) so they render visibly
The history rewrite redacted the account id/username to <ACCOUNT_ID>/<OPERATOR>, but the angle
brackets are parsed as unknown HTML tags by markdown renderers (GitHub) and pandoc, so the
placeholders rendered invisibly. Replaced <ACCOUNT_ID>->ACCOUNT_ID and <OPERATOR>->OPERATOR
across all tracked files (15 text files, 21+1 occurrences) and regenerated HANDOFF.docx from the
corrected .md. Verified: placeholders now visible in both the .md and the rendered .docx; the
real account id/username remain absent (0/0).

Co-Authored-By: Claude Opus 4.8 <noreply@anthropic.com>
</commit_message>
<xml_diff>
--- a/docs/HANDOFF.docx
+++ b/docs/HANDOFF.docx
@@ -3459,10 +3459,7 @@
         <w:t xml:space="preserve"> </w:t>
       </w:r>
       <w:r>
-        <w:t xml:space="preserve">AWS-only, single account (</w:t>
-      </w:r>
-      <w:r>
-        <w:t xml:space="preserve">), region</w:t>
+        <w:t xml:space="preserve">AWS-only, single account (ACCOUNT_ID), region</w:t>
       </w:r>
       <w:r>
         <w:t xml:space="preserve"> </w:t>

</xml_diff>

<commit_message>
docs: F6/F7 findings (reject unexercisable on current data; feed sampling bias) + Hawwk demo-prep; regen HANDOFF.docx
Add two threat-model findings on top of F5:
- F6: the reject path is implemented and correct but unexercisable on
  current public-source data (no-name-only-auto-reject principle meets
  TIN-less USASpending/keyless-SAM inputs). Not a build gap.
- F7: feed sampling bias (amount-descending) misses the small-vendor
  at-risk population; the one real overlap (Hawwk LLC, ~$86K) is caught
  when fed directly but below the feed floor. Matcher not at fault.

Threat model (F6/F7 sections, CI4A map, risk table), HANDOFF (§4.1 rows
15/16, §5 residual 10/11, §6 follow-on 8), DEMO_SCRIPT (Hawwk staging-
free real-overlap prep + base-rate honesty line). HANDOFF.docx
regenerated from the corrected md.

Co-Authored-By: Claude Opus 4.8 <noreply@anthropic.com>
</commit_message>
<xml_diff>
--- a/docs/HANDOFF.docx
+++ b/docs/HANDOFF.docx
@@ -2,33 +2,7 @@
 <file path=word/document.xml><?xml version="1.0" encoding="utf-8"?>
 <w:document xmlns:w="http://schemas.openxmlformats.org/wordprocessingml/2006/main" xmlns:m="http://schemas.openxmlformats.org/officeDocument/2006/math" xmlns:r="http://schemas.openxmlformats.org/officeDocument/2006/relationships" xmlns:o="urn:schemas-microsoft-com:office:office" xmlns:v="urn:schemas-microsoft-com:vml" xmlns:w10="urn:schemas-microsoft-com:office:word" xmlns:a="http://schemas.openxmlformats.org/drawingml/2006/main" xmlns:pic="http://schemas.openxmlformats.org/drawingml/2006/picture" xmlns:wp="http://schemas.openxmlformats.org/drawingml/2006/wordprocessingDrawing">
   <w:body>
-    <w:sdt>
-      <w:sdtPr>
-        <w:docPartObj>
-          <w:docPartGallery w:val="Table of Contents"/>
-          <w:docPartUnique/>
-        </w:docPartObj>
-      </w:sdtPr>
-      <w:sdtContent>
-        <w:p>
-          <w:pPr>
-            <w:pStyle w:val="TOCHeading"/>
-          </w:pPr>
-          <w:r>
-            <w:t xml:space="preserve">Table of Contents</w:t>
-          </w:r>
-        </w:p>
-        <w:p>
-          <w:r>
-            <w:fldChar w:fldCharType="begin" w:dirty="true"/>
-            <w:instrText xml:space="preserve">TOC \o "1-2" \h \z \u</w:instrText>
-            <w:fldChar w:fldCharType="separate"/>
-            <w:fldChar w:fldCharType="end"/>
-          </w:r>
-        </w:p>
-      </w:sdtContent>
-    </w:sdt>
-    <w:bookmarkStart w:id="41" w:name="X44127cd4d515337d35c36cfa226558b168f51ff"/>
+    <w:bookmarkStart w:id="30" w:name="X44127cd4d515337d35c36cfa226558b168f51ff"/>
     <w:p>
       <w:pPr>
         <w:pStyle w:val="Heading1"/>
@@ -37,13 +11,7 @@
         <w:t xml:space="preserve">PrePayGuard (</w:t>
       </w:r>
       <w:r>
-        <w:t xml:space="preserve">“</w:t>
-      </w:r>
-      <w:r>
-        <w:t xml:space="preserve">Treasury</w:t>
-      </w:r>
-      <w:r>
-        <w:t xml:space="preserve">”</w:t>
+        <w:t xml:space="preserve">“Treasury”</w:t>
       </w:r>
       <w:r>
         <w:t xml:space="preserve">): Capstone Handoff Package</w:t>
@@ -390,7 +358,7 @@
         </w:pict>
       </w:r>
     </w:p>
-    <w:bookmarkStart w:id="26" w:name="architecture-notes"/>
+    <w:bookmarkStart w:id="15" w:name="architecture-notes"/>
     <w:p>
       <w:pPr>
         <w:pStyle w:val="Heading2"/>
@@ -476,7 +444,7 @@
         <w:t xml:space="preserve">.)</w:t>
       </w:r>
     </w:p>
-    <w:bookmarkStart w:id="20" w:name="system-overview"/>
+    <w:bookmarkStart w:id="9" w:name="system-overview"/>
     <w:p>
       <w:pPr>
         <w:pStyle w:val="Heading3"/>
@@ -964,8 +932,8 @@
         <w:t xml:space="preserve">(8×).</w:t>
       </w:r>
     </w:p>
-    <w:bookmarkEnd w:id="20"/>
-    <w:bookmarkStart w:id="21" w:name="components"/>
+    <w:bookmarkEnd w:id="9"/>
+    <w:bookmarkStart w:id="10" w:name="components"/>
     <w:p>
       <w:pPr>
         <w:pStyle w:val="Heading3"/>
@@ -996,7 +964,6 @@
           <w:p>
             <w:pPr>
               <w:pStyle w:val="Compact"/>
-              <w:jc w:val="left"/>
             </w:pPr>
             <w:r>
               <w:t xml:space="preserve">#</w:t>
@@ -1008,7 +975,6 @@
           <w:p>
             <w:pPr>
               <w:pStyle w:val="Compact"/>
-              <w:jc w:val="left"/>
             </w:pPr>
             <w:r>
               <w:t xml:space="preserve">Component</w:t>
@@ -1020,7 +986,6 @@
           <w:p>
             <w:pPr>
               <w:pStyle w:val="Compact"/>
-              <w:jc w:val="left"/>
             </w:pPr>
             <w:r>
               <w:t xml:space="preserve">Responsibility</w:t>
@@ -1032,7 +997,6 @@
           <w:p>
             <w:pPr>
               <w:pStyle w:val="Compact"/>
-              <w:jc w:val="left"/>
             </w:pPr>
             <w:r>
               <w:t xml:space="preserve">Key decisions</w:t>
@@ -1046,7 +1010,6 @@
           <w:p>
             <w:pPr>
               <w:pStyle w:val="Compact"/>
-              <w:jc w:val="left"/>
             </w:pPr>
             <w:r>
               <w:t xml:space="preserve">A</w:t>
@@ -1058,7 +1021,6 @@
           <w:p>
             <w:pPr>
               <w:pStyle w:val="Compact"/>
-              <w:jc w:val="left"/>
             </w:pPr>
             <w:r>
               <w:t xml:space="preserve">Payment Intake API</w:t>
@@ -1070,7 +1032,6 @@
           <w:p>
             <w:pPr>
               <w:pStyle w:val="Compact"/>
-              <w:jc w:val="left"/>
             </w:pPr>
             <w:r>
               <w:t xml:space="preserve">IAM-authed intake; payment-ID idempotency (PENDING→SENT); enqueue</w:t>
@@ -1082,7 +1043,6 @@
           <w:p>
             <w:pPr>
               <w:pStyle w:val="Compact"/>
-              <w:jc w:val="left"/>
             </w:pPr>
             <w:r>
               <w:t xml:space="preserve">DEC-5, DEC-13</w:t>
@@ -1096,7 +1056,6 @@
           <w:p>
             <w:pPr>
               <w:pStyle w:val="Compact"/>
-              <w:jc w:val="left"/>
             </w:pPr>
             <w:r>
               <w:t xml:space="preserve">B</w:t>
@@ -1108,7 +1067,6 @@
           <w:p>
             <w:pPr>
               <w:pStyle w:val="Compact"/>
-              <w:jc w:val="left"/>
             </w:pPr>
             <w:r>
               <w:t xml:space="preserve">Enrichment &amp; Reference-Match</w:t>
@@ -1120,7 +1078,6 @@
           <w:p>
             <w:pPr>
               <w:pStyle w:val="Compact"/>
-              <w:jc w:val="left"/>
             </w:pPr>
             <w:r>
               <w:t xml:space="preserve">Match payee/TIN: TIN/name exact, fuzzy, and Bedrock-embedding</w:t>
@@ -1142,7 +1099,6 @@
           <w:p>
             <w:pPr>
               <w:pStyle w:val="Compact"/>
-              <w:jc w:val="left"/>
             </w:pPr>
             <w:r>
               <w:t xml:space="preserve">DEC-14, DEC-18, DEC-19</w:t>
@@ -1156,7 +1112,6 @@
           <w:p>
             <w:pPr>
               <w:pStyle w:val="Compact"/>
-              <w:jc w:val="left"/>
             </w:pPr>
             <w:r>
               <w:t xml:space="preserve">C</w:t>
@@ -1168,7 +1123,6 @@
           <w:p>
             <w:pPr>
               <w:pStyle w:val="Compact"/>
-              <w:jc w:val="left"/>
             </w:pPr>
             <w:r>
               <w:t xml:space="preserve">Risk-Scoring &amp; Decision</w:t>
@@ -1180,7 +1134,6 @@
           <w:p>
             <w:pPr>
               <w:pStyle w:val="Compact"/>
-              <w:jc w:val="left"/>
             </w:pPr>
             <w:r>
               <w:t xml:space="preserve">Transparent rule-based score → three-way disposition</w:t>
@@ -1192,7 +1145,6 @@
           <w:p>
             <w:pPr>
               <w:pStyle w:val="Compact"/>
-              <w:jc w:val="left"/>
             </w:pPr>
             <w:r>
               <w:t xml:space="preserve">DEC-14</w:t>
@@ -1206,7 +1158,6 @@
           <w:p>
             <w:pPr>
               <w:pStyle w:val="Compact"/>
-              <w:jc w:val="left"/>
             </w:pPr>
             <w:r>
               <w:t xml:space="preserve">D</w:t>
@@ -1218,7 +1169,6 @@
           <w:p>
             <w:pPr>
               <w:pStyle w:val="Compact"/>
-              <w:jc w:val="left"/>
             </w:pPr>
             <w:r>
               <w:t xml:space="preserve">Disposition Router &amp; Audit Logger</w:t>
@@ -1230,7 +1180,6 @@
           <w:p>
             <w:pPr>
               <w:pStyle w:val="Compact"/>
-              <w:jc w:val="left"/>
             </w:pPr>
             <w:r>
               <w:t xml:space="preserve">Immutable audit write; route review; webhook notify</w:t>
@@ -1242,7 +1191,6 @@
           <w:p>
             <w:pPr>
               <w:pStyle w:val="Compact"/>
-              <w:jc w:val="left"/>
             </w:pPr>
             <w:r>
               <w:t xml:space="preserve">DEC-4, DEC-7</w:t>
@@ -1256,7 +1204,6 @@
           <w:p>
             <w:pPr>
               <w:pStyle w:val="Compact"/>
-              <w:jc w:val="left"/>
             </w:pPr>
             <w:r>
               <w:t xml:space="preserve">E</w:t>
@@ -1268,7 +1215,6 @@
           <w:p>
             <w:pPr>
               <w:pStyle w:val="Compact"/>
-              <w:jc w:val="left"/>
             </w:pPr>
             <w:r>
               <w:t xml:space="preserve">Batch Ingest</w:t>
@@ -1280,7 +1226,6 @@
           <w:p>
             <w:pPr>
               <w:pStyle w:val="Compact"/>
-              <w:jc w:val="left"/>
             </w:pPr>
             <w:r>
               <w:t xml:space="preserve">S3-triggered bulk CSV/Excel/JSON; reuses A’s queue + idempotency table</w:t>
@@ -1292,7 +1237,6 @@
           <w:p>
             <w:pPr>
               <w:pStyle w:val="Compact"/>
-              <w:jc w:val="left"/>
             </w:pPr>
             <w:r>
               <w:t xml:space="preserve">DEC-16</w:t>
@@ -1306,7 +1250,6 @@
           <w:p>
             <w:pPr>
               <w:pStyle w:val="Compact"/>
-              <w:jc w:val="left"/>
             </w:pPr>
             <w:r>
               <w:t xml:space="preserve">F</w:t>
@@ -1318,7 +1261,6 @@
           <w:p>
             <w:pPr>
               <w:pStyle w:val="Compact"/>
-              <w:jc w:val="left"/>
             </w:pPr>
             <w:r>
               <w:t xml:space="preserve">Feeder</w:t>
@@ -1330,7 +1272,6 @@
           <w:p>
             <w:pPr>
               <w:pStyle w:val="Compact"/>
-              <w:jc w:val="left"/>
             </w:pPr>
             <w:r>
               <w:t xml:space="preserve">Scheduled USAspending pull (business-hours ET), drops a file for E; deterministic ids dedupe</w:t>
@@ -1342,7 +1283,6 @@
           <w:p>
             <w:pPr>
               <w:pStyle w:val="Compact"/>
-              <w:jc w:val="left"/>
             </w:pPr>
             <w:r>
               <w:t xml:space="preserve">DEC-23, DEC-25, DEC-26</w:t>
@@ -1356,7 +1296,6 @@
           <w:p>
             <w:pPr>
               <w:pStyle w:val="Compact"/>
-              <w:jc w:val="left"/>
             </w:pPr>
             <w:r>
               <w:t xml:space="preserve">G</w:t>
@@ -1368,7 +1307,6 @@
           <w:p>
             <w:pPr>
               <w:pStyle w:val="Compact"/>
-              <w:jc w:val="left"/>
             </w:pPr>
             <w:r>
               <w:t xml:space="preserve">Refresher</w:t>
@@ -1380,7 +1318,6 @@
           <w:p>
             <w:pPr>
               <w:pStyle w:val="Compact"/>
-              <w:jc w:val="left"/>
             </w:pPr>
             <w:r>
               <w:t xml:space="preserve">Scheduled daily SAM.gov re-pull, re-embed, republish the versioned list only on change</w:t>
@@ -1392,7 +1329,6 @@
           <w:p>
             <w:pPr>
               <w:pStyle w:val="Compact"/>
-              <w:jc w:val="left"/>
             </w:pPr>
             <w:r>
               <w:t xml:space="preserve">DEC-24</w:t>
@@ -1406,7 +1342,6 @@
           <w:p>
             <w:pPr>
               <w:pStyle w:val="Compact"/>
-              <w:jc w:val="left"/>
             </w:pPr>
             <w:r>
               <w:t xml:space="preserve">,</w:t>
@@ -1418,7 +1353,6 @@
           <w:p>
             <w:pPr>
               <w:pStyle w:val="Compact"/>
-              <w:jc w:val="left"/>
             </w:pPr>
             <w:r>
               <w:t xml:space="preserve">Console API</w:t>
@@ -1430,7 +1364,6 @@
           <w:p>
             <w:pPr>
               <w:pStyle w:val="Compact"/>
-              <w:jc w:val="left"/>
             </w:pPr>
             <w:r>
               <w:t xml:space="preserve">Reviews, audit, decisions, batches, reference publish, feed config, LLM briefs, analytics</w:t>
@@ -1442,7 +1375,6 @@
           <w:p>
             <w:pPr>
               <w:pStyle w:val="Compact"/>
-              <w:jc w:val="left"/>
             </w:pPr>
             <w:r>
               <w:t xml:space="preserve">DEC-15, DEC-17..27</w:t>
@@ -1451,8 +1383,8 @@
         </w:tc>
       </w:tr>
     </w:tbl>
-    <w:bookmarkEnd w:id="21"/>
-    <w:bookmarkStart w:id="22" w:name="screening-intelligence-phase-3"/>
+    <w:bookmarkEnd w:id="10"/>
+    <w:bookmarkStart w:id="11" w:name="screening-intelligence-phase-3"/>
     <w:p>
       <w:pPr>
         <w:pStyle w:val="Heading3"/>
@@ -1884,8 +1816,8 @@
         <w:t xml:space="preserve">grounded only in the audit record, advisory, never written to the immutable record.</w:t>
       </w:r>
     </w:p>
-    <w:bookmarkEnd w:id="22"/>
-    <w:bookmarkStart w:id="23" w:name="console-roles-and-oversight-phases-2-4"/>
+    <w:bookmarkEnd w:id="11"/>
+    <w:bookmarkStart w:id="12" w:name="console-roles-and-oversight-phases-2-4"/>
     <w:p>
       <w:pPr>
         <w:pStyle w:val="Heading3"/>
@@ -2116,8 +2048,8 @@
         <w:t xml:space="preserve">the handler.</w:t>
       </w:r>
     </w:p>
-    <w:bookmarkEnd w:id="23"/>
-    <w:bookmarkStart w:id="24" w:name="rollback-dec-10"/>
+    <w:bookmarkEnd w:id="12"/>
+    <w:bookmarkStart w:id="13" w:name="rollback-dec-10"/>
     <w:p>
       <w:pPr>
         <w:pStyle w:val="Heading3"/>
@@ -2213,8 +2145,8 @@
         <w:t xml:space="preserve">.</w:t>
       </w:r>
     </w:p>
-    <w:bookmarkEnd w:id="24"/>
-    <w:bookmarkStart w:id="25" w:name="known-unknowns-course-objective-3"/>
+    <w:bookmarkEnd w:id="13"/>
+    <w:bookmarkStart w:id="14" w:name="known-unknowns-course-objective-3"/>
     <w:p>
       <w:pPr>
         <w:pStyle w:val="Heading3"/>
@@ -2302,9 +2234,9 @@
         </w:pict>
       </w:r>
     </w:p>
-    <w:bookmarkEnd w:id="25"/>
-    <w:bookmarkEnd w:id="26"/>
-    <w:bookmarkStart w:id="30" w:name="tests"/>
+    <w:bookmarkEnd w:id="14"/>
+    <w:bookmarkEnd w:id="15"/>
+    <w:bookmarkStart w:id="19" w:name="tests"/>
     <w:p>
       <w:pPr>
         <w:pStyle w:val="Heading2"/>
@@ -2416,7 +2348,7 @@
         </w:rPr>
         <w:t xml:space="preserve"> </w:t>
       </w:r>
-      <w:hyperlink r:id="rId27">
+      <w:hyperlink r:id="rId16">
         <w:r>
           <w:rPr>
             <w:rStyle w:val="VerbatimChar"/>
@@ -2452,7 +2384,7 @@
         <w:t xml:space="preserve">.</w:t>
       </w:r>
     </w:p>
-    <w:bookmarkStart w:id="28" w:name="graded-commitment-evidence"/>
+    <w:bookmarkStart w:id="17" w:name="graded-commitment-evidence"/>
     <w:p>
       <w:pPr>
         <w:pStyle w:val="Heading3"/>
@@ -2483,7 +2415,6 @@
           <w:p>
             <w:pPr>
               <w:pStyle w:val="Compact"/>
-              <w:jc w:val="left"/>
             </w:pPr>
             <w:r>
               <w:t xml:space="preserve">#</w:t>
@@ -2495,7 +2426,6 @@
           <w:p>
             <w:pPr>
               <w:pStyle w:val="Compact"/>
-              <w:jc w:val="left"/>
             </w:pPr>
             <w:r>
               <w:t xml:space="preserve">Commitment</w:t>
@@ -2507,7 +2437,6 @@
           <w:p>
             <w:pPr>
               <w:pStyle w:val="Compact"/>
-              <w:jc w:val="left"/>
             </w:pPr>
             <w:r>
               <w:t xml:space="preserve">Test file</w:t>
@@ -2519,7 +2448,6 @@
           <w:p>
             <w:pPr>
               <w:pStyle w:val="Compact"/>
-              <w:jc w:val="left"/>
             </w:pPr>
             <w:r>
               <w:t xml:space="preserve">Result</w:t>
@@ -2533,7 +2461,6 @@
           <w:p>
             <w:pPr>
               <w:pStyle w:val="Compact"/>
-              <w:jc w:val="left"/>
             </w:pPr>
             <w:r>
               <w:t xml:space="preserve">1</w:t>
@@ -2545,7 +2472,6 @@
           <w:p>
             <w:pPr>
               <w:pStyle w:val="Compact"/>
-              <w:jc w:val="left"/>
             </w:pPr>
             <w:r>
               <w:t xml:space="preserve">Idempotency (payment-ID dedup)</w:t>
@@ -2557,7 +2483,6 @@
           <w:p>
             <w:pPr>
               <w:pStyle w:val="Compact"/>
-              <w:jc w:val="left"/>
             </w:pPr>
             <w:r>
               <w:rPr>
@@ -2572,7 +2497,6 @@
           <w:p>
             <w:pPr>
               <w:pStyle w:val="Compact"/>
-              <w:jc w:val="left"/>
             </w:pPr>
             <w:r>
               <w:t xml:space="preserve">PASS +</w:t>
@@ -2602,7 +2526,6 @@
           <w:p>
             <w:pPr>
               <w:pStyle w:val="Compact"/>
-              <w:jc w:val="left"/>
             </w:pPr>
             <w:r>
               <w:t xml:space="preserve">2</w:t>
@@ -2614,7 +2537,6 @@
           <w:p>
             <w:pPr>
               <w:pStyle w:val="Compact"/>
-              <w:jc w:val="left"/>
             </w:pPr>
             <w:r>
               <w:t xml:space="preserve">Failure routing → manual review</w:t>
@@ -2626,7 +2548,6 @@
           <w:p>
             <w:pPr>
               <w:pStyle w:val="Compact"/>
-              <w:jc w:val="left"/>
             </w:pPr>
             <w:r>
               <w:rPr>
@@ -2641,7 +2562,6 @@
           <w:p>
             <w:pPr>
               <w:pStyle w:val="Compact"/>
-              <w:jc w:val="left"/>
             </w:pPr>
             <w:r>
               <w:t xml:space="preserve">PASS +</w:t>
@@ -2665,7 +2585,6 @@
           <w:p>
             <w:pPr>
               <w:pStyle w:val="Compact"/>
-              <w:jc w:val="left"/>
             </w:pPr>
             <w:r>
               <w:t xml:space="preserve">3</w:t>
@@ -2677,7 +2596,6 @@
           <w:p>
             <w:pPr>
               <w:pStyle w:val="Compact"/>
-              <w:jc w:val="left"/>
             </w:pPr>
             <w:r>
               <w:t xml:space="preserve">Queue-depth scaling</w:t>
@@ -2689,7 +2607,6 @@
           <w:p>
             <w:pPr>
               <w:pStyle w:val="Compact"/>
-              <w:jc w:val="left"/>
             </w:pPr>
             <w:r>
               <w:rPr>
@@ -2704,7 +2621,6 @@
           <w:p>
             <w:pPr>
               <w:pStyle w:val="Compact"/>
-              <w:jc w:val="left"/>
             </w:pPr>
             <w:r>
               <w:t xml:space="preserve">PASS (config proof)</w:t>
@@ -2718,7 +2634,6 @@
           <w:p>
             <w:pPr>
               <w:pStyle w:val="Compact"/>
-              <w:jc w:val="left"/>
             </w:pPr>
             <w:r>
               <w:t xml:space="preserve">4</w:t>
@@ -2730,7 +2645,6 @@
           <w:p>
             <w:pPr>
               <w:pStyle w:val="Compact"/>
-              <w:jc w:val="left"/>
             </w:pPr>
             <w:r>
               <w:t xml:space="preserve">S3 Object Lock immutability</w:t>
@@ -2742,7 +2656,6 @@
           <w:p>
             <w:pPr>
               <w:pStyle w:val="Compact"/>
-              <w:jc w:val="left"/>
             </w:pPr>
             <w:r>
               <w:rPr>
@@ -2757,7 +2670,6 @@
           <w:p>
             <w:pPr>
               <w:pStyle w:val="Compact"/>
-              <w:jc w:val="left"/>
             </w:pPr>
             <w:r>
               <w:t xml:space="preserve">PASS +</w:t>
@@ -2787,7 +2699,6 @@
           <w:p>
             <w:pPr>
               <w:pStyle w:val="Compact"/>
-              <w:jc w:val="left"/>
             </w:pPr>
             <w:r>
               <w:t xml:space="preserve">,</w:t>
@@ -2799,7 +2710,6 @@
           <w:p>
             <w:pPr>
               <w:pStyle w:val="Compact"/>
-              <w:jc w:val="left"/>
             </w:pPr>
             <w:r>
               <w:t xml:space="preserve">Review webhook + scoped secret (DEC-7)</w:t>
@@ -2811,7 +2721,6 @@
           <w:p>
             <w:pPr>
               <w:pStyle w:val="Compact"/>
-              <w:jc w:val="left"/>
             </w:pPr>
             <w:r>
               <w:rPr>
@@ -2826,7 +2735,6 @@
           <w:p>
             <w:pPr>
               <w:pStyle w:val="Compact"/>
-              <w:jc w:val="left"/>
             </w:pPr>
             <w:r>
               <w:t xml:space="preserve">PASS +</w:t>
@@ -2850,7 +2758,6 @@
           <w:p>
             <w:pPr>
               <w:pStyle w:val="Compact"/>
-              <w:jc w:val="left"/>
             </w:pPr>
             <w:r>
               <w:t xml:space="preserve">,</w:t>
@@ -2862,7 +2769,6 @@
           <w:p>
             <w:pPr>
               <w:pStyle w:val="Compact"/>
-              <w:jc w:val="left"/>
             </w:pPr>
             <w:r>
               <w:t xml:space="preserve">Enrichment + semantic matching</w:t>
@@ -2874,7 +2780,6 @@
           <w:p>
             <w:pPr>
               <w:pStyle w:val="Compact"/>
-              <w:jc w:val="left"/>
             </w:pPr>
             <w:r>
               <w:rPr>
@@ -2889,7 +2794,6 @@
           <w:p>
             <w:pPr>
               <w:pStyle w:val="Compact"/>
-              <w:jc w:val="left"/>
             </w:pPr>
             <w:r>
               <w:t xml:space="preserve">PASS</w:t>
@@ -2903,7 +2807,6 @@
           <w:p>
             <w:pPr>
               <w:pStyle w:val="Compact"/>
-              <w:jc w:val="left"/>
             </w:pPr>
             <w:r>
               <w:t xml:space="preserve">,</w:t>
@@ -2915,7 +2818,6 @@
           <w:p>
             <w:pPr>
               <w:pStyle w:val="Compact"/>
-              <w:jc w:val="left"/>
             </w:pPr>
             <w:r>
               <w:t xml:space="preserve">Risk scoring / disposition</w:t>
@@ -2927,7 +2829,6 @@
           <w:p>
             <w:pPr>
               <w:pStyle w:val="Compact"/>
-              <w:jc w:val="left"/>
             </w:pPr>
             <w:r>
               <w:rPr>
@@ -2942,7 +2843,6 @@
           <w:p>
             <w:pPr>
               <w:pStyle w:val="Compact"/>
-              <w:jc w:val="left"/>
             </w:pPr>
             <w:r>
               <w:t xml:space="preserve">PASS</w:t>
@@ -2956,7 +2856,6 @@
           <w:p>
             <w:pPr>
               <w:pStyle w:val="Compact"/>
-              <w:jc w:val="left"/>
             </w:pPr>
             <w:r>
               <w:t xml:space="preserve">,</w:t>
@@ -2968,7 +2867,6 @@
           <w:p>
             <w:pPr>
               <w:pStyle w:val="Compact"/>
-              <w:jc w:val="left"/>
             </w:pPr>
             <w:r>
               <w:t xml:space="preserve">Batch ingest (DEC-16)</w:t>
@@ -2980,7 +2878,6 @@
           <w:p>
             <w:pPr>
               <w:pStyle w:val="Compact"/>
-              <w:jc w:val="left"/>
             </w:pPr>
             <w:r>
               <w:rPr>
@@ -2995,7 +2892,6 @@
           <w:p>
             <w:pPr>
               <w:pStyle w:val="Compact"/>
-              <w:jc w:val="left"/>
             </w:pPr>
             <w:r>
               <w:t xml:space="preserve">PASS</w:t>
@@ -3009,7 +2905,6 @@
           <w:p>
             <w:pPr>
               <w:pStyle w:val="Compact"/>
-              <w:jc w:val="left"/>
             </w:pPr>
             <w:r>
               <w:t xml:space="preserve">,</w:t>
@@ -3021,7 +2916,6 @@
           <w:p>
             <w:pPr>
               <w:pStyle w:val="Compact"/>
-              <w:jc w:val="left"/>
             </w:pPr>
             <w:r>
               <w:t xml:space="preserve">Console API (roles, briefs, analytics, reference)</w:t>
@@ -3033,7 +2927,6 @@
           <w:p>
             <w:pPr>
               <w:pStyle w:val="Compact"/>
-              <w:jc w:val="left"/>
             </w:pPr>
             <w:r>
               <w:rPr>
@@ -3048,7 +2941,6 @@
           <w:p>
             <w:pPr>
               <w:pStyle w:val="Compact"/>
-              <w:jc w:val="left"/>
             </w:pPr>
             <w:r>
               <w:t xml:space="preserve">PASS</w:t>
@@ -3062,7 +2954,6 @@
           <w:p>
             <w:pPr>
               <w:pStyle w:val="Compact"/>
-              <w:jc w:val="left"/>
             </w:pPr>
             <w:r>
               <w:t xml:space="preserve">,</w:t>
@@ -3074,7 +2965,6 @@
           <w:p>
             <w:pPr>
               <w:pStyle w:val="Compact"/>
-              <w:jc w:val="left"/>
             </w:pPr>
             <w:r>
               <w:t xml:space="preserve">Semantic-eval metric math (objective 5)</w:t>
@@ -3086,7 +2976,6 @@
           <w:p>
             <w:pPr>
               <w:pStyle w:val="Compact"/>
-              <w:jc w:val="left"/>
             </w:pPr>
             <w:r>
               <w:rPr>
@@ -3101,7 +2990,6 @@
           <w:p>
             <w:pPr>
               <w:pStyle w:val="Compact"/>
-              <w:jc w:val="left"/>
             </w:pPr>
             <w:r>
               <w:t xml:space="preserve">PASS</w:t>
@@ -3115,7 +3003,6 @@
           <w:p>
             <w:pPr>
               <w:pStyle w:val="Compact"/>
-              <w:jc w:val="left"/>
             </w:pPr>
             <w:r>
               <w:t xml:space="preserve">,</w:t>
@@ -3127,7 +3014,6 @@
           <w:p>
             <w:pPr>
               <w:pStyle w:val="Compact"/>
-              <w:jc w:val="left"/>
             </w:pPr>
             <w:r>
               <w:t xml:space="preserve">Real SAM ingestion (objective 10)</w:t>
@@ -3139,7 +3025,6 @@
           <w:p>
             <w:pPr>
               <w:pStyle w:val="Compact"/>
-              <w:jc w:val="left"/>
             </w:pPr>
             <w:r>
               <w:rPr>
@@ -3154,7 +3039,6 @@
           <w:p>
             <w:pPr>
               <w:pStyle w:val="Compact"/>
-              <w:jc w:val="left"/>
             </w:pPr>
             <w:r>
               <w:t xml:space="preserve">PASS</w:t>
@@ -3168,7 +3052,6 @@
           <w:p>
             <w:pPr>
               <w:pStyle w:val="Compact"/>
-              <w:jc w:val="left"/>
             </w:pPr>
             <w:r>
               <w:t xml:space="preserve">,</w:t>
@@ -3180,7 +3063,6 @@
           <w:p>
             <w:pPr>
               <w:pStyle w:val="Compact"/>
-              <w:jc w:val="left"/>
             </w:pPr>
             <w:r>
               <w:t xml:space="preserve">Feeder: USAspending pull, mapping, config (F)</w:t>
@@ -3192,7 +3074,6 @@
           <w:p>
             <w:pPr>
               <w:pStyle w:val="Compact"/>
-              <w:jc w:val="left"/>
             </w:pPr>
             <w:r>
               <w:rPr>
@@ -3207,7 +3088,6 @@
           <w:p>
             <w:pPr>
               <w:pStyle w:val="Compact"/>
-              <w:jc w:val="left"/>
             </w:pPr>
             <w:r>
               <w:t xml:space="preserve">PASS +</w:t>
@@ -3231,7 +3111,6 @@
           <w:p>
             <w:pPr>
               <w:pStyle w:val="Compact"/>
-              <w:jc w:val="left"/>
             </w:pPr>
             <w:r>
               <w:t xml:space="preserve">,</w:t>
@@ -3243,7 +3122,6 @@
           <w:p>
             <w:pPr>
               <w:pStyle w:val="Compact"/>
-              <w:jc w:val="left"/>
             </w:pPr>
             <w:r>
               <w:t xml:space="preserve">Refresher: SAM re-pull, change-only publish (G)</w:t>
@@ -3255,7 +3133,6 @@
           <w:p>
             <w:pPr>
               <w:pStyle w:val="Compact"/>
-              <w:jc w:val="left"/>
             </w:pPr>
             <w:r>
               <w:rPr>
@@ -3270,7 +3147,6 @@
           <w:p>
             <w:pPr>
               <w:pStyle w:val="Compact"/>
-              <w:jc w:val="left"/>
             </w:pPr>
             <w:r>
               <w:t xml:space="preserve">PASS +</w:t>
@@ -3289,8 +3165,8 @@
         </w:tc>
       </w:tr>
     </w:tbl>
-    <w:bookmarkEnd w:id="28"/>
-    <w:bookmarkStart w:id="29" w:name="live-end-to-end-real-aws"/>
+    <w:bookmarkEnd w:id="17"/>
+    <w:bookmarkStart w:id="18" w:name="live-end-to-end-real-aws"/>
     <w:p>
       <w:pPr>
         <w:pStyle w:val="Heading3"/>
@@ -3402,13 +3278,7 @@
         <w:t xml:space="preserve">(</w:t>
       </w:r>
       <w:r>
-        <w:t xml:space="preserve">“</w:t>
-      </w:r>
-      <w:r>
-        <w:t xml:space="preserve">YATAI SMART INDUSTRIAL NEW CITY</w:t>
-      </w:r>
-      <w:r>
-        <w:t xml:space="preserve">”</w:t>
+        <w:t xml:space="preserve">“YATAI SMART INDUSTRIAL NEW CITY”</w:t>
       </w:r>
       <w:r>
         <w:t xml:space="preserve">) screened through the full pipeline into the live</w:t>
@@ -3454,9 +3324,9 @@
         </w:pict>
       </w:r>
     </w:p>
-    <w:bookmarkEnd w:id="29"/>
-    <w:bookmarkEnd w:id="30"/>
-    <w:bookmarkStart w:id="31" w:name="deployment-documentation"/>
+    <w:bookmarkEnd w:id="18"/>
+    <w:bookmarkEnd w:id="19"/>
+    <w:bookmarkStart w:id="20" w:name="deployment-documentation"/>
     <w:p>
       <w:pPr>
         <w:pStyle w:val="Heading2"/>
@@ -3662,7 +3532,7 @@
         <w:rPr>
           <w:rStyle w:val="VerbatimChar"/>
         </w:rPr>
-        <w:t xml:space="preserve">terraform   apply</w:t>
+        <w:t xml:space="preserve">terraform apply</w:t>
       </w:r>
       <w:r>
         <w:t xml:space="preserve"> </w:t>
@@ -4154,8 +4024,8 @@
         </w:pict>
       </w:r>
     </w:p>
-    <w:bookmarkEnd w:id="31"/>
-    <w:bookmarkStart w:id="33" w:name="security-findings"/>
+    <w:bookmarkEnd w:id="20"/>
+    <w:bookmarkStart w:id="22" w:name="security-findings"/>
     <w:p>
       <w:pPr>
         <w:pStyle w:val="Heading2"/>
@@ -4607,7 +4477,7 @@
         <w:t xml:space="preserve">§5). The semantic matcher only ever adds a REVIEW flag.</w:t>
       </w:r>
     </w:p>
-    <w:bookmarkStart w:id="32" w:name="risk-rating-table-dec-11"/>
+    <w:bookmarkStart w:id="21" w:name="risk-rating-table-dec-11"/>
     <w:p>
       <w:pPr>
         <w:pStyle w:val="Heading3"/>
@@ -4708,7 +4578,6 @@
           <w:p>
             <w:pPr>
               <w:pStyle w:val="Compact"/>
-              <w:jc w:val="left"/>
             </w:pPr>
             <w:r>
               <w:t xml:space="preserve">#</w:t>
@@ -4720,7 +4589,6 @@
           <w:p>
             <w:pPr>
               <w:pStyle w:val="Compact"/>
-              <w:jc w:val="left"/>
             </w:pPr>
             <w:r>
               <w:t xml:space="preserve">Finding</w:t>
@@ -4732,7 +4600,6 @@
           <w:p>
             <w:pPr>
               <w:pStyle w:val="Compact"/>
-              <w:jc w:val="left"/>
             </w:pPr>
             <w:r>
               <w:t xml:space="preserve">Area / component</w:t>
@@ -4744,7 +4611,6 @@
           <w:p>
             <w:pPr>
               <w:pStyle w:val="Compact"/>
-              <w:jc w:val="left"/>
             </w:pPr>
             <w:r>
               <w:t xml:space="preserve">Severity</w:t>
@@ -4756,7 +4622,6 @@
           <w:p>
             <w:pPr>
               <w:pStyle w:val="Compact"/>
-              <w:jc w:val="left"/>
             </w:pPr>
             <w:r>
               <w:t xml:space="preserve">Status</w:t>
@@ -4768,7 +4633,6 @@
           <w:p>
             <w:pPr>
               <w:pStyle w:val="Compact"/>
-              <w:jc w:val="left"/>
             </w:pPr>
             <w:r>
               <w:t xml:space="preserve">Evidence</w:t>
@@ -4782,7 +4646,6 @@
           <w:p>
             <w:pPr>
               <w:pStyle w:val="Compact"/>
-              <w:jc w:val="left"/>
             </w:pPr>
             <w:r>
               <w:t xml:space="preserve">1</w:t>
@@ -4794,7 +4657,6 @@
           <w:p>
             <w:pPr>
               <w:pStyle w:val="Compact"/>
-              <w:jc w:val="left"/>
             </w:pPr>
             <w:r>
               <w:t xml:space="preserve">CloudWatch alarms (queue-depth, DLQ-not-empty) have no notification target (</w:t>
@@ -4818,7 +4680,6 @@
           <w:p>
             <w:pPr>
               <w:pStyle w:val="Compact"/>
-              <w:jc w:val="left"/>
             </w:pPr>
             <w:r>
               <w:t xml:space="preserve">Observability / B-C-D, review queue</w:t>
@@ -4830,7 +4691,6 @@
           <w:p>
             <w:pPr>
               <w:pStyle w:val="Compact"/>
-              <w:jc w:val="left"/>
             </w:pPr>
             <w:r>
               <w:rPr>
@@ -4846,7 +4706,6 @@
           <w:p>
             <w:pPr>
               <w:pStyle w:val="Compact"/>
-              <w:jc w:val="left"/>
             </w:pPr>
             <w:r>
               <w:t xml:space="preserve">Open (follow-on: wire an SNS topic). Partial backstop: the review queue’s</w:t>
@@ -4873,7 +4732,6 @@
           <w:p>
             <w:pPr>
               <w:pStyle w:val="Compact"/>
-              <w:jc w:val="left"/>
             </w:pPr>
             <w:r>
               <w:rPr>
@@ -4896,7 +4754,6 @@
           <w:p>
             <w:pPr>
               <w:pStyle w:val="Compact"/>
-              <w:jc w:val="left"/>
             </w:pPr>
             <w:r>
               <w:t xml:space="preserve">2</w:t>
@@ -4908,7 +4765,6 @@
           <w:p>
             <w:pPr>
               <w:pStyle w:val="Compact"/>
-              <w:jc w:val="left"/>
             </w:pPr>
             <w:r>
               <w:t xml:space="preserve">Console JS dependencies are not CVE-scanned in CI (</w:t>
@@ -4938,7 +4794,6 @@
           <w:p>
             <w:pPr>
               <w:pStyle w:val="Compact"/>
-              <w:jc w:val="left"/>
             </w:pPr>
             <w:r>
               <w:t xml:space="preserve">Supply chain / console</w:t>
@@ -4950,7 +4805,6 @@
           <w:p>
             <w:pPr>
               <w:pStyle w:val="Compact"/>
-              <w:jc w:val="left"/>
             </w:pPr>
             <w:r>
               <w:rPr>
@@ -4966,7 +4820,6 @@
           <w:p>
             <w:pPr>
               <w:pStyle w:val="Compact"/>
-              <w:jc w:val="left"/>
             </w:pPr>
             <w:r>
               <w:t xml:space="preserve">Open (follow-on: enable</w:t>
@@ -4993,7 +4846,6 @@
           <w:p>
             <w:pPr>
               <w:pStyle w:val="Compact"/>
-              <w:jc w:val="left"/>
             </w:pPr>
             <w:r>
               <w:rPr>
@@ -5010,7 +4862,6 @@
           <w:p>
             <w:pPr>
               <w:pStyle w:val="Compact"/>
-              <w:jc w:val="left"/>
             </w:pPr>
             <w:r>
               <w:t xml:space="preserve">3</w:t>
@@ -5022,7 +4873,6 @@
           <w:p>
             <w:pPr>
               <w:pStyle w:val="Compact"/>
-              <w:jc w:val="left"/>
             </w:pPr>
             <w:r>
               <w:t xml:space="preserve">Local Terraform state; safe for one operator, unsafe for team/CI applies</w:t>
@@ -5034,7 +4884,6 @@
           <w:p>
             <w:pPr>
               <w:pStyle w:val="Compact"/>
-              <w:jc w:val="left"/>
             </w:pPr>
             <w:r>
               <w:t xml:space="preserve">Deployment / state</w:t>
@@ -5046,7 +4895,6 @@
           <w:p>
             <w:pPr>
               <w:pStyle w:val="Compact"/>
-              <w:jc w:val="left"/>
             </w:pPr>
             <w:r>
               <w:rPr>
@@ -5062,7 +4910,6 @@
           <w:p>
             <w:pPr>
               <w:pStyle w:val="Compact"/>
-              <w:jc w:val="left"/>
             </w:pPr>
             <w:r>
               <w:t xml:space="preserve">Accepted at course scope; remote state + OIDC plan role is the production upgrade</w:t>
@@ -5074,7 +4921,6 @@
           <w:p>
             <w:pPr>
               <w:pStyle w:val="Compact"/>
-              <w:jc w:val="left"/>
             </w:pPr>
             <w:r>
               <w:rPr>
@@ -5103,7 +4949,6 @@
           <w:p>
             <w:pPr>
               <w:pStyle w:val="Compact"/>
-              <w:jc w:val="left"/>
             </w:pPr>
             <w:r>
               <w:t xml:space="preserve">4</w:t>
@@ -5115,7 +4960,6 @@
           <w:p>
             <w:pPr>
               <w:pStyle w:val="Compact"/>
-              <w:jc w:val="left"/>
             </w:pPr>
             <w:r>
               <w:t xml:space="preserve">One real screening source (SAM exclusions) capped to a demo-sized slice; three sources remain synthetic</w:t>
@@ -5127,7 +4971,6 @@
           <w:p>
             <w:pPr>
               <w:pStyle w:val="Compact"/>
-              <w:jc w:val="left"/>
             </w:pPr>
             <w:r>
               <w:t xml:space="preserve">Data fidelity / reference list</w:t>
@@ -5139,7 +4982,6 @@
           <w:p>
             <w:pPr>
               <w:pStyle w:val="Compact"/>
-              <w:jc w:val="left"/>
             </w:pPr>
             <w:r>
               <w:rPr>
@@ -5155,7 +4997,6 @@
           <w:p>
             <w:pPr>
               <w:pStyle w:val="Compact"/>
-              <w:jc w:val="left"/>
             </w:pPr>
             <w:r>
               <w:t xml:space="preserve">Accepted / documented; full extract + record linkage is follow-on</w:t>
@@ -5167,7 +5008,6 @@
           <w:p>
             <w:pPr>
               <w:pStyle w:val="Compact"/>
-              <w:jc w:val="left"/>
             </w:pPr>
             <w:r>
               <w:t xml:space="preserve">DEC-22,</w:t>
@@ -5190,7 +5030,6 @@
           <w:p>
             <w:pPr>
               <w:pStyle w:val="Compact"/>
-              <w:jc w:val="left"/>
             </w:pPr>
             <w:r>
               <w:t xml:space="preserve">5</w:t>
@@ -5202,7 +5041,6 @@
           <w:p>
             <w:pPr>
               <w:pStyle w:val="Compact"/>
-              <w:jc w:val="left"/>
             </w:pPr>
             <w:r>
               <w:t xml:space="preserve">Semantic matcher is defeated by name</w:t>
@@ -5227,13 +5065,7 @@
               <w:t xml:space="preserve"> </w:t>
             </w:r>
             <w:r>
-              <w:t xml:space="preserve">“</w:t>
-            </w:r>
-            <w:r>
-              <w:t xml:space="preserve">recall 1.00</w:t>
-            </w:r>
-            <w:r>
-              <w:t xml:space="preserve">”</w:t>
+              <w:t xml:space="preserve">“recall 1.00”</w:t>
             </w:r>
             <w:r>
               <w:t xml:space="preserve"> </w:t>
@@ -5261,7 +5093,6 @@
           <w:p>
             <w:pPr>
               <w:pStyle w:val="Compact"/>
-              <w:jc w:val="left"/>
             </w:pPr>
             <w:r>
               <w:t xml:space="preserve">Model robustness / component B</w:t>
@@ -5273,7 +5104,6 @@
           <w:p>
             <w:pPr>
               <w:pStyle w:val="Compact"/>
-              <w:jc w:val="left"/>
             </w:pPr>
             <w:r>
               <w:rPr>
@@ -5289,7 +5119,6 @@
           <w:p>
             <w:pPr>
               <w:pStyle w:val="Compact"/>
-              <w:jc w:val="left"/>
             </w:pPr>
             <w:r>
               <w:rPr>
@@ -5311,7 +5140,6 @@
           <w:p>
             <w:pPr>
               <w:pStyle w:val="Compact"/>
-              <w:jc w:val="left"/>
             </w:pPr>
             <w:r>
               <w:rPr>
@@ -5358,7 +5186,6 @@
           <w:p>
             <w:pPr>
               <w:pStyle w:val="Compact"/>
-              <w:jc w:val="left"/>
             </w:pPr>
             <w:r>
               <w:t xml:space="preserve">6</w:t>
@@ -5370,7 +5197,6 @@
           <w:p>
             <w:pPr>
               <w:pStyle w:val="Compact"/>
-              <w:jc w:val="left"/>
             </w:pPr>
             <w:r>
               <w:t xml:space="preserve">Bedrock is a soft dependency in B; an outage silently degrades the semantic net to rule-based screening</w:t>
@@ -5382,7 +5208,6 @@
           <w:p>
             <w:pPr>
               <w:pStyle w:val="Compact"/>
-              <w:jc w:val="left"/>
             </w:pPr>
             <w:r>
               <w:t xml:space="preserve">Availability / component B</w:t>
@@ -5394,7 +5219,6 @@
           <w:p>
             <w:pPr>
               <w:pStyle w:val="Compact"/>
-              <w:jc w:val="left"/>
             </w:pPr>
             <w:r>
               <w:rPr>
@@ -5410,7 +5234,6 @@
           <w:p>
             <w:pPr>
               <w:pStyle w:val="Compact"/>
-              <w:jc w:val="left"/>
             </w:pPr>
             <w:r>
               <w:t xml:space="preserve">Mitigated: fails safe to deterministic rules (not blind); a Bedrock-availability alarm is follow-on</w:t>
@@ -5422,7 +5245,6 @@
           <w:p>
             <w:pPr>
               <w:pStyle w:val="Compact"/>
-              <w:jc w:val="left"/>
             </w:pPr>
             <w:r>
               <w:rPr>
@@ -5445,7 +5267,6 @@
           <w:p>
             <w:pPr>
               <w:pStyle w:val="Compact"/>
-              <w:jc w:val="left"/>
             </w:pPr>
             <w:r>
               <w:t xml:space="preserve">7</w:t>
@@ -5457,7 +5278,6 @@
           <w:p>
             <w:pPr>
               <w:pStyle w:val="Compact"/>
-              <w:jc w:val="left"/>
             </w:pPr>
             <w:r>
               <w:t xml:space="preserve">Single webhook notification path for review routing (DEC-7)</w:t>
@@ -5469,7 +5289,6 @@
           <w:p>
             <w:pPr>
               <w:pStyle w:val="Compact"/>
-              <w:jc w:val="left"/>
             </w:pPr>
             <w:r>
               <w:t xml:space="preserve">Review routing / component D</w:t>
@@ -5481,7 +5300,6 @@
           <w:p>
             <w:pPr>
               <w:pStyle w:val="Compact"/>
-              <w:jc w:val="left"/>
             </w:pPr>
             <w:r>
               <w:rPr>
@@ -5497,7 +5315,6 @@
           <w:p>
             <w:pPr>
               <w:pStyle w:val="Compact"/>
-              <w:jc w:val="left"/>
             </w:pPr>
             <w:r>
               <w:t xml:space="preserve">Mitigated by the age-of-oldest-message alarm; a second path is follow-on</w:t>
@@ -5509,7 +5326,6 @@
           <w:p>
             <w:pPr>
               <w:pStyle w:val="Compact"/>
-              <w:jc w:val="left"/>
             </w:pPr>
             <w:r>
               <w:t xml:space="preserve">DEC-7,</w:t>
@@ -5532,7 +5348,6 @@
           <w:p>
             <w:pPr>
               <w:pStyle w:val="Compact"/>
-              <w:jc w:val="left"/>
             </w:pPr>
             <w:r>
               <w:t xml:space="preserve">8</w:t>
@@ -5544,7 +5359,6 @@
           <w:p>
             <w:pPr>
               <w:pStyle w:val="Compact"/>
-              <w:jc w:val="left"/>
             </w:pPr>
             <w:r>
               <w:t xml:space="preserve">Console MFA is opt-in TOTP, not enforced; more broadly, identity hardening (enforced MFA, no long-lived credentials) was under-applied during development, including on the operator’s own AWS account</w:t>
@@ -5556,7 +5370,6 @@
           <w:p>
             <w:pPr>
               <w:pStyle w:val="Compact"/>
-              <w:jc w:val="left"/>
             </w:pPr>
             <w:r>
               <w:t xml:space="preserve">Identity / Cognito + operational</w:t>
@@ -5568,7 +5381,6 @@
           <w:p>
             <w:pPr>
               <w:pStyle w:val="Compact"/>
-              <w:jc w:val="left"/>
             </w:pPr>
             <w:r>
               <w:rPr>
@@ -5584,7 +5396,6 @@
           <w:p>
             <w:pPr>
               <w:pStyle w:val="Compact"/>
-              <w:jc w:val="left"/>
             </w:pPr>
             <w:r>
               <w:t xml:space="preserve">Partly remediated: the operator account was hardened (MFA enabled, credentials rotated) after this was identified; enforcing Cognito MFA on the console is the first follow-on hardening step</w:t>
@@ -5596,7 +5407,6 @@
           <w:p>
             <w:pPr>
               <w:pStyle w:val="Compact"/>
-              <w:jc w:val="left"/>
             </w:pPr>
             <w:r>
               <w:rPr>
@@ -5616,7 +5426,6 @@
           <w:p>
             <w:pPr>
               <w:pStyle w:val="Compact"/>
-              <w:jc w:val="left"/>
             </w:pPr>
             <w:r>
               <w:t xml:space="preserve">9</w:t>
@@ -5628,7 +5437,6 @@
           <w:p>
             <w:pPr>
               <w:pStyle w:val="Compact"/>
-              <w:jc w:val="left"/>
             </w:pPr>
             <w:r>
               <w:rPr>
@@ -5658,7 +5466,6 @@
           <w:p>
             <w:pPr>
               <w:pStyle w:val="Compact"/>
-              <w:jc w:val="left"/>
             </w:pPr>
             <w:r>
               <w:t xml:space="preserve">API surface</w:t>
@@ -5670,7 +5477,6 @@
           <w:p>
             <w:pPr>
               <w:pStyle w:val="Compact"/>
-              <w:jc w:val="left"/>
             </w:pPr>
             <w:r>
               <w:rPr>
@@ -5686,7 +5492,6 @@
           <w:p>
             <w:pPr>
               <w:pStyle w:val="Compact"/>
-              <w:jc w:val="left"/>
             </w:pPr>
             <w:r>
               <w:t xml:space="preserve">Accepted; the</w:t>
@@ -5722,7 +5527,6 @@
           <w:p>
             <w:pPr>
               <w:pStyle w:val="Compact"/>
-              <w:jc w:val="left"/>
             </w:pPr>
             <w:r>
               <w:rPr>
@@ -5751,7 +5555,6 @@
           <w:p>
             <w:pPr>
               <w:pStyle w:val="Compact"/>
-              <w:jc w:val="left"/>
             </w:pPr>
             <w:r>
               <w:t xml:space="preserve">10</w:t>
@@ -5763,7 +5566,6 @@
           <w:p>
             <w:pPr>
               <w:pStyle w:val="Compact"/>
-              <w:jc w:val="left"/>
             </w:pPr>
             <w:r>
               <w:t xml:space="preserve">WAF absent on the APIs and CloudFront; no cross-region replication of the audit bucket</w:t>
@@ -5775,7 +5577,6 @@
           <w:p>
             <w:pPr>
               <w:pStyle w:val="Compact"/>
-              <w:jc w:val="left"/>
             </w:pPr>
             <w:r>
               <w:t xml:space="preserve">Edge protection / DR</w:t>
@@ -5787,7 +5588,6 @@
           <w:p>
             <w:pPr>
               <w:pStyle w:val="Compact"/>
-              <w:jc w:val="left"/>
             </w:pPr>
             <w:r>
               <w:rPr>
@@ -5803,7 +5603,6 @@
           <w:p>
             <w:pPr>
               <w:pStyle w:val="Compact"/>
-              <w:jc w:val="left"/>
             </w:pPr>
             <w:r>
               <w:t xml:space="preserve">Accepted at course scope (IAM-authed, resource-policy-scoped, single-region); recorded as residual risk</w:t>
@@ -5815,7 +5614,6 @@
           <w:p>
             <w:pPr>
               <w:pStyle w:val="Compact"/>
-              <w:jc w:val="left"/>
             </w:pPr>
             <w:r>
               <w:rPr>
@@ -5838,7 +5636,6 @@
           <w:p>
             <w:pPr>
               <w:pStyle w:val="Compact"/>
-              <w:jc w:val="left"/>
             </w:pPr>
             <w:r>
               <w:t xml:space="preserve">11</w:t>
@@ -5850,7 +5647,6 @@
           <w:p>
             <w:pPr>
               <w:pStyle w:val="Compact"/>
-              <w:jc w:val="left"/>
             </w:pPr>
             <w:r>
               <w:t xml:space="preserve">No load / DR / chaos testing; cold-start latency unmeasured under load</w:t>
@@ -5862,7 +5658,6 @@
           <w:p>
             <w:pPr>
               <w:pStyle w:val="Compact"/>
-              <w:jc w:val="left"/>
             </w:pPr>
             <w:r>
               <w:t xml:space="preserve">Performance / resilience</w:t>
@@ -5874,7 +5669,6 @@
           <w:p>
             <w:pPr>
               <w:pStyle w:val="Compact"/>
-              <w:jc w:val="left"/>
             </w:pPr>
             <w:r>
               <w:rPr>
@@ -5890,7 +5684,6 @@
           <w:p>
             <w:pPr>
               <w:pStyle w:val="Compact"/>
-              <w:jc w:val="left"/>
             </w:pPr>
             <w:r>
               <w:t xml:space="preserve">Open (follow-on: load + chaos testing, right-size memory/concurrency)</w:t>
@@ -5902,7 +5695,6 @@
           <w:p>
             <w:pPr>
               <w:pStyle w:val="Compact"/>
-              <w:jc w:val="left"/>
             </w:pPr>
             <w:r>
               <w:t xml:space="preserve">§5.5, §6.5</w:t>
@@ -5916,7 +5708,6 @@
           <w:p>
             <w:pPr>
               <w:pStyle w:val="Compact"/>
-              <w:jc w:val="left"/>
             </w:pPr>
             <w:r>
               <w:t xml:space="preserve">12</w:t>
@@ -5928,7 +5719,6 @@
           <w:p>
             <w:pPr>
               <w:pStyle w:val="Compact"/>
-              <w:jc w:val="left"/>
             </w:pPr>
             <w:r>
               <w:t xml:space="preserve">Every Lambda container image carries</w:t>
@@ -5998,7 +5788,6 @@
           <w:p>
             <w:pPr>
               <w:pStyle w:val="Compact"/>
-              <w:jc w:val="left"/>
             </w:pPr>
             <w:r>
               <w:t xml:space="preserve">Supply chain / all images</w:t>
@@ -6010,7 +5799,6 @@
           <w:p>
             <w:pPr>
               <w:pStyle w:val="Compact"/>
-              <w:jc w:val="left"/>
             </w:pPr>
             <w:r>
               <w:rPr>
@@ -6026,7 +5814,6 @@
           <w:p>
             <w:pPr>
               <w:pStyle w:val="Compact"/>
-              <w:jc w:val="left"/>
             </w:pPr>
             <w:r>
               <w:t xml:space="preserve">Open (follow-on: rebuild on a patched base image /</w:t>
@@ -6053,7 +5840,6 @@
           <w:p>
             <w:pPr>
               <w:pStyle w:val="Compact"/>
-              <w:jc w:val="left"/>
             </w:pPr>
             <w:r>
               <w:rPr>
@@ -6070,7 +5856,6 @@
           <w:p>
             <w:pPr>
               <w:pStyle w:val="Compact"/>
-              <w:jc w:val="left"/>
             </w:pPr>
             <w:r>
               <w:t xml:space="preserve">13</w:t>
@@ -6082,7 +5867,6 @@
           <w:p>
             <w:pPr>
               <w:pStyle w:val="Compact"/>
-              <w:jc w:val="left"/>
             </w:pPr>
             <w:r>
               <w:t xml:space="preserve">Matcher</w:t>
@@ -6131,7 +5915,6 @@
           <w:p>
             <w:pPr>
               <w:pStyle w:val="Compact"/>
-              <w:jc w:val="left"/>
             </w:pPr>
             <w:r>
               <w:t xml:space="preserve">Model robustness / component B</w:t>
@@ -6143,7 +5926,6 @@
           <w:p>
             <w:pPr>
               <w:pStyle w:val="Compact"/>
-              <w:jc w:val="left"/>
             </w:pPr>
             <w:r>
               <w:rPr>
@@ -6159,7 +5941,6 @@
           <w:p>
             <w:pPr>
               <w:pStyle w:val="Compact"/>
-              <w:jc w:val="left"/>
             </w:pPr>
             <w:r>
               <w:t xml:space="preserve">Contained:</w:t>
@@ -6186,7 +5967,6 @@
           <w:p>
             <w:pPr>
               <w:pStyle w:val="Compact"/>
-              <w:jc w:val="left"/>
             </w:pPr>
             <w:r>
               <w:rPr>
@@ -6218,7 +5998,6 @@
           <w:p>
             <w:pPr>
               <w:pStyle w:val="Compact"/>
-              <w:jc w:val="left"/>
             </w:pPr>
             <w:r>
               <w:t xml:space="preserve">14</w:t>
@@ -6230,7 +6009,6 @@
           <w:p>
             <w:pPr>
               <w:pStyle w:val="Compact"/>
-              <w:jc w:val="left"/>
             </w:pPr>
             <w:r>
               <w:t xml:space="preserve">Input-validation cap (F1 remediation) makes 1/11 over-length listed entities unscreenable: name exceeds the 35-char field, exact+fuzzy fail, only the fragile semantic layer remains</w:t>
@@ -6242,7 +6020,6 @@
           <w:p>
             <w:pPr>
               <w:pStyle w:val="Compact"/>
-              <w:jc w:val="left"/>
             </w:pPr>
             <w:r>
               <w:t xml:space="preserve">Model robustness / remediation tradeoff</w:t>
@@ -6254,7 +6031,6 @@
           <w:p>
             <w:pPr>
               <w:pStyle w:val="Compact"/>
-              <w:jc w:val="left"/>
             </w:pPr>
             <w:r>
               <w:rPr>
@@ -6270,7 +6046,6 @@
           <w:p>
             <w:pPr>
               <w:pStyle w:val="Compact"/>
-              <w:jc w:val="left"/>
             </w:pPr>
             <w:r>
               <w:t xml:space="preserve">Open; the windowed-matcher follow-on that fixes F1 also fixes this</w:t>
@@ -6282,7 +6057,6 @@
           <w:p>
             <w:pPr>
               <w:pStyle w:val="Compact"/>
-              <w:jc w:val="left"/>
             </w:pPr>
             <w:r>
               <w:rPr>
@@ -6299,6 +6073,279 @@
           </w:p>
         </w:tc>
       </w:tr>
+      <w:tr>
+        <w:tc>
+          <w:tcPr/>
+          <w:p>
+            <w:pPr>
+              <w:pStyle w:val="Compact"/>
+            </w:pPr>
+            <w:r>
+              <w:t xml:space="preserve">15</w:t>
+            </w:r>
+          </w:p>
+        </w:tc>
+        <w:tc>
+          <w:tcPr/>
+          <w:p>
+            <w:pPr>
+              <w:pStyle w:val="Compact"/>
+            </w:pPr>
+            <w:r>
+              <w:rPr>
+                <w:rStyle w:val="VerbatimChar"/>
+                <w:b/>
+                <w:bCs/>
+              </w:rPr>
+              <w:t xml:space="preserve">reject</w:t>
+            </w:r>
+            <w:r>
+              <w:rPr>
+                <w:b/>
+                <w:bCs/>
+              </w:rPr>
+              <w:t xml:space="preserve"> </w:t>
+            </w:r>
+            <w:r>
+              <w:rPr>
+                <w:b/>
+                <w:bCs/>
+              </w:rPr>
+              <w:t xml:space="preserve">is implemented and correct, but unexercisable on current data (F6).</w:t>
+            </w:r>
+            <w:r>
+              <w:t xml:space="preserve"> </w:t>
+            </w:r>
+            <w:r>
+              <w:t xml:space="preserve">By design the system never auto-rejects on a name alone: name matches cap at 60 → review (</w:t>
+            </w:r>
+            <w:r>
+              <w:rPr>
+                <w:rStyle w:val="VerbatimChar"/>
+              </w:rPr>
+              <w:t xml:space="preserve">component_c_risk_scoring/app.py:25,27,50</w:t>
+            </w:r>
+            <w:r>
+              <w:t xml:space="preserve">), and reject is reserved for TIN-level identity confirmation (conf 95 ≥ 80). Neither public source carries a TIN — the feeder maps name+amount only (</w:t>
+            </w:r>
+            <w:r>
+              <w:rPr>
+                <w:rStyle w:val="VerbatimChar"/>
+              </w:rPr>
+              <w:t xml:space="preserve">component_f_feeder/app.py:142,156</w:t>
+            </w:r>
+            <w:r>
+              <w:t xml:space="preserve">) and the keyless SAM export has none (only the 6 synthetic seeds carry TINs; the 90 real SAM entries do not). So current data can only produce</w:t>
+            </w:r>
+            <w:r>
+              <w:t xml:space="preserve"> </w:t>
+            </w:r>
+            <w:r>
+              <w:rPr>
+                <w:rStyle w:val="VerbatimChar"/>
+              </w:rPr>
+              <w:t xml:space="preserve">approve</w:t>
+            </w:r>
+            <w:r>
+              <w:t xml:space="preserve"> </w:t>
+            </w:r>
+            <w:r>
+              <w:t xml:space="preserve">or</w:t>
+            </w:r>
+            <w:r>
+              <w:t xml:space="preserve"> </w:t>
+            </w:r>
+            <w:r>
+              <w:rPr>
+                <w:rStyle w:val="VerbatimChar"/>
+              </w:rPr>
+              <w:t xml:space="preserve">review</w:t>
+            </w:r>
+          </w:p>
+        </w:tc>
+        <w:tc>
+          <w:tcPr/>
+          <w:p>
+            <w:pPr>
+              <w:pStyle w:val="Compact"/>
+            </w:pPr>
+            <w:r>
+              <w:t xml:space="preserve">Design principle × data limitation / components C, F, B</w:t>
+            </w:r>
+          </w:p>
+        </w:tc>
+        <w:tc>
+          <w:tcPr/>
+          <w:p>
+            <w:pPr>
+              <w:pStyle w:val="Compact"/>
+            </w:pPr>
+            <w:r>
+              <w:rPr>
+                <w:b/>
+                <w:bCs/>
+              </w:rPr>
+              <w:t xml:space="preserve">Medium</w:t>
+            </w:r>
+          </w:p>
+        </w:tc>
+        <w:tc>
+          <w:tcPr/>
+          <w:p>
+            <w:pPr>
+              <w:pStyle w:val="Compact"/>
+            </w:pPr>
+            <w:r>
+              <w:t xml:space="preserve">Not a build gap and not a two-state classifier — reject is correctly built but the present data cannot trigger it. Ingest a real identifier (UEI/TIN) to exercise reject against real entries (follow-on §6)</w:t>
+            </w:r>
+          </w:p>
+        </w:tc>
+        <w:tc>
+          <w:tcPr/>
+          <w:p>
+            <w:pPr>
+              <w:pStyle w:val="Compact"/>
+            </w:pPr>
+            <w:r>
+              <w:rPr>
+                <w:rStyle w:val="VerbatimChar"/>
+              </w:rPr>
+              <w:t xml:space="preserve">docs/sme/INJECTION_THREAT_MODEL.md</w:t>
+            </w:r>
+            <w:r>
+              <w:t xml:space="preserve"> </w:t>
+            </w:r>
+            <w:r>
+              <w:t xml:space="preserve">F6</w:t>
+            </w:r>
+          </w:p>
+        </w:tc>
+      </w:tr>
+      <w:tr>
+        <w:tc>
+          <w:tcPr/>
+          <w:p>
+            <w:pPr>
+              <w:pStyle w:val="Compact"/>
+            </w:pPr>
+            <w:r>
+              <w:t xml:space="preserve">16</w:t>
+            </w:r>
+          </w:p>
+        </w:tc>
+        <w:tc>
+          <w:tcPr/>
+          <w:p>
+            <w:pPr>
+              <w:pStyle w:val="Compact"/>
+            </w:pPr>
+            <w:r>
+              <w:rPr>
+                <w:b/>
+                <w:bCs/>
+              </w:rPr>
+              <w:t xml:space="preserve">Feed sampling bias misses the at-risk population (F7).</w:t>
+            </w:r>
+            <w:r>
+              <w:t xml:space="preserve"> </w:t>
+            </w:r>
+            <w:r>
+              <w:t xml:space="preserve">The feeder sorts by award amount descending over ~500 pages (</w:t>
+            </w:r>
+            <w:r>
+              <w:rPr>
+                <w:rStyle w:val="VerbatimChar"/>
+              </w:rPr>
+              <w:t xml:space="preserve">component_f_feeder/app.py:117,40,58-60</w:t>
+            </w:r>
+            <w:r>
+              <w:t xml:space="preserve">); reach floor ~$13M (page 450). Debarred small vendors receiving small awards sit below it and are invisible to the feed. The one real SAM-excluded entity with real awards (</w:t>
+            </w:r>
+            <w:r>
+              <w:rPr>
+                <w:rStyle w:val="VerbatimChar"/>
+              </w:rPr>
+              <w:t xml:space="preserve">Hawwk LLC</w:t>
+            </w:r>
+            <w:r>
+              <w:t xml:space="preserve">, ~$86K) is never reachable by the default query, though the matcher catches it when fed directly (name_exact → review). 0/300 fed awards hit</w:t>
+            </w:r>
+          </w:p>
+        </w:tc>
+        <w:tc>
+          <w:tcPr/>
+          <w:p>
+            <w:pPr>
+              <w:pStyle w:val="Compact"/>
+            </w:pPr>
+            <w:r>
+              <w:t xml:space="preserve">Data path / component F</w:t>
+            </w:r>
+          </w:p>
+        </w:tc>
+        <w:tc>
+          <w:tcPr/>
+          <w:p>
+            <w:pPr>
+              <w:pStyle w:val="Compact"/>
+            </w:pPr>
+            <w:r>
+              <w:rPr>
+                <w:b/>
+                <w:bCs/>
+              </w:rPr>
+              <w:t xml:space="preserve">Medium</w:t>
+            </w:r>
+          </w:p>
+        </w:tc>
+        <w:tc>
+          <w:tcPr/>
+          <w:p>
+            <w:pPr>
+              <w:pStyle w:val="Compact"/>
+            </w:pPr>
+            <w:r>
+              <w:t xml:space="preserve">Sampling–mission misalignment,</w:t>
+            </w:r>
+            <w:r>
+              <w:t xml:space="preserve"> </w:t>
+            </w:r>
+            <w:r>
+              <w:rPr>
+                <w:b/>
+                <w:bCs/>
+              </w:rPr>
+              <w:t xml:space="preserve">not</w:t>
+            </w:r>
+            <w:r>
+              <w:t xml:space="preserve"> </w:t>
+            </w:r>
+            <w:r>
+              <w:t xml:space="preserve">a matcher failure. Fix: amount-independent/randomized or small-award-focused sampling (follow-on §6)</w:t>
+            </w:r>
+          </w:p>
+        </w:tc>
+        <w:tc>
+          <w:tcPr/>
+          <w:p>
+            <w:pPr>
+              <w:pStyle w:val="Compact"/>
+            </w:pPr>
+            <w:r>
+              <w:rPr>
+                <w:rStyle w:val="VerbatimChar"/>
+              </w:rPr>
+              <w:t xml:space="preserve">docs/sme/INJECTION_THREAT_MODEL.md</w:t>
+            </w:r>
+            <w:r>
+              <w:t xml:space="preserve"> </w:t>
+            </w:r>
+            <w:r>
+              <w:t xml:space="preserve">F7</w:t>
+            </w:r>
+          </w:p>
+        </w:tc>
+      </w:tr>
     </w:tbl>
     <w:p>
       <w:pPr>
@@ -6379,9 +6426,9 @@
         </w:pict>
       </w:r>
     </w:p>
-    <w:bookmarkEnd w:id="32"/>
-    <w:bookmarkEnd w:id="33"/>
-    <w:bookmarkStart w:id="34" w:name="residual-risks"/>
+    <w:bookmarkEnd w:id="21"/>
+    <w:bookmarkEnd w:id="22"/>
+    <w:bookmarkStart w:id="23" w:name="residual-risks"/>
     <w:p>
       <w:pPr>
         <w:pStyle w:val="Heading2"/>
@@ -6790,14 +6837,294 @@
       </w:r>
     </w:p>
     <w:p>
+      <w:pPr>
+        <w:pStyle w:val="Compact"/>
+        <w:numPr>
+          <w:ilvl w:val="0"/>
+          <w:numId w:val="1007"/>
+        </w:numPr>
+      </w:pPr>
+      <w:r>
+        <w:rPr>
+          <w:rStyle w:val="VerbatimChar"/>
+          <w:b/>
+          <w:bCs/>
+        </w:rPr>
+        <w:t xml:space="preserve">reject</w:t>
+      </w:r>
+      <w:r>
+        <w:rPr>
+          <w:b/>
+          <w:bCs/>
+        </w:rPr>
+        <w:t xml:space="preserve"> </w:t>
+      </w:r>
+      <w:r>
+        <w:rPr>
+          <w:b/>
+          <w:bCs/>
+        </w:rPr>
+        <w:t xml:space="preserve">implemented and correct, but unexercisable on current data (F6, Medium):</w:t>
+      </w:r>
+      <w:r>
+        <w:t xml:space="preserve"> </w:t>
+      </w:r>
+      <w:r>
+        <w:t xml:space="preserve">by</w:t>
+      </w:r>
+      <w:r>
+        <w:t xml:space="preserve"> </w:t>
+      </w:r>
+      <w:r>
+        <w:t xml:space="preserve">design the system never auto-rejects on a name alone — name matches cap at 60 → review</w:t>
+      </w:r>
+      <w:r>
+        <w:t xml:space="preserve"> </w:t>
+      </w:r>
+      <w:r>
+        <w:t xml:space="preserve">(</w:t>
+      </w:r>
+      <w:r>
+        <w:rPr>
+          <w:rStyle w:val="VerbatimChar"/>
+        </w:rPr>
+        <w:t xml:space="preserve">component_c_risk_scoring/app.py:25,27,50</w:t>
+      </w:r>
+      <w:r>
+        <w:t xml:space="preserve">) and reject is reserved for TIN-level identity</w:t>
+      </w:r>
+      <w:r>
+        <w:t xml:space="preserve"> </w:t>
+      </w:r>
+      <w:r>
+        <w:t xml:space="preserve">confirmation (conf 95 ≥ 80), which avoids wrongly rejecting legitimate look-alikes (the F5</w:t>
+      </w:r>
+      <w:r>
+        <w:t xml:space="preserve"> </w:t>
+      </w:r>
+      <w:r>
+        <w:t xml:space="preserve">mode). That correct principle meets a data limitation: neither public source carries a TIN —</w:t>
+      </w:r>
+      <w:r>
+        <w:t xml:space="preserve"> </w:t>
+      </w:r>
+      <w:r>
+        <w:t xml:space="preserve">USAspending keys on UEI so the feeder maps name+amount only (</w:t>
+      </w:r>
+      <w:r>
+        <w:rPr>
+          <w:rStyle w:val="VerbatimChar"/>
+        </w:rPr>
+        <w:t xml:space="preserve">component_f_feeder/app.py:142,156</w:t>
+      </w:r>
+      <w:r>
+        <w:t xml:space="preserve">),</w:t>
+      </w:r>
+      <w:r>
+        <w:t xml:space="preserve"> </w:t>
+      </w:r>
+      <w:r>
+        <w:t xml:space="preserve">and the keyless SAM export has none (only the 6 synthetic seeds carry TINs; the 90 real SAM</w:t>
+      </w:r>
+      <w:r>
+        <w:t xml:space="preserve"> </w:t>
+      </w:r>
+      <w:r>
+        <w:t xml:space="preserve">entries do not). Current data therefore yields only</w:t>
+      </w:r>
+      <w:r>
+        <w:t xml:space="preserve"> </w:t>
+      </w:r>
+      <w:r>
+        <w:rPr>
+          <w:rStyle w:val="VerbatimChar"/>
+        </w:rPr>
+        <w:t xml:space="preserve">approve</w:t>
+      </w:r>
+      <w:r>
+        <w:t xml:space="preserve"> </w:t>
+      </w:r>
+      <w:r>
+        <w:t xml:space="preserve">or</w:t>
+      </w:r>
+      <w:r>
+        <w:t xml:space="preserve"> </w:t>
+      </w:r>
+      <w:r>
+        <w:rPr>
+          <w:rStyle w:val="VerbatimChar"/>
+        </w:rPr>
+        <w:t xml:space="preserve">review</w:t>
+      </w:r>
+      <w:r>
+        <w:t xml:space="preserve">. This is</w:t>
+      </w:r>
+      <w:r>
+        <w:t xml:space="preserve"> </w:t>
+      </w:r>
+      <w:r>
+        <w:rPr>
+          <w:b/>
+          <w:bCs/>
+        </w:rPr>
+        <w:t xml:space="preserve">not</w:t>
+      </w:r>
+      <w:r>
+        <w:t xml:space="preserve"> </w:t>
+      </w:r>
+      <w:r>
+        <w:t xml:space="preserve">a</w:t>
+      </w:r>
+      <w:r>
+        <w:t xml:space="preserve"> </w:t>
+      </w:r>
+      <w:r>
+        <w:t xml:space="preserve">build gap and</w:t>
+      </w:r>
+      <w:r>
+        <w:t xml:space="preserve"> </w:t>
+      </w:r>
+      <w:r>
+        <w:rPr>
+          <w:b/>
+          <w:bCs/>
+        </w:rPr>
+        <w:t xml:space="preserve">not</w:t>
+      </w:r>
+      <w:r>
+        <w:t xml:space="preserve"> </w:t>
+      </w:r>
+      <w:r>
+        <w:t xml:space="preserve">a two-state classifier — the reject branch is correctly built but present</w:t>
+      </w:r>
+      <w:r>
+        <w:t xml:space="preserve"> </w:t>
+      </w:r>
+      <w:r>
+        <w:t xml:space="preserve">data cannot trigger it, so it is unexercised by feed traffic and a demo cannot show an organic</w:t>
+      </w:r>
+      <w:r>
+        <w:t xml:space="preserve"> </w:t>
+      </w:r>
+      <w:r>
+        <w:t xml:space="preserve">reject. Ingest a real identifier (UEI/TIN) to exercise reject against real entries (§4.1 row 15).</w:t>
+      </w:r>
+      <w:r>
+        <w:t xml:space="preserve"> </w:t>
+      </w:r>
+      <w:r>
+        <w:rPr>
+          <w:rStyle w:val="VerbatimChar"/>
+        </w:rPr>
+        <w:t xml:space="preserve">INJECTION_THREAT_MODEL.md</w:t>
+      </w:r>
+      <w:r>
+        <w:t xml:space="preserve"> </w:t>
+      </w:r>
+      <w:r>
+        <w:t xml:space="preserve">F6.</w:t>
+      </w:r>
+    </w:p>
+    <w:p>
+      <w:pPr>
+        <w:pStyle w:val="Compact"/>
+        <w:numPr>
+          <w:ilvl w:val="0"/>
+          <w:numId w:val="1007"/>
+        </w:numPr>
+      </w:pPr>
+      <w:r>
+        <w:rPr>
+          <w:b/>
+          <w:bCs/>
+        </w:rPr>
+        <w:t xml:space="preserve">Feed sampling bias (F7, Medium):</w:t>
+      </w:r>
+      <w:r>
+        <w:t xml:space="preserve"> </w:t>
+      </w:r>
+      <w:r>
+        <w:t xml:space="preserve">the feeder samples by award amount descending</w:t>
+      </w:r>
+      <w:r>
+        <w:t xml:space="preserve"> </w:t>
+      </w:r>
+      <w:r>
+        <w:t xml:space="preserve">(</w:t>
+      </w:r>
+      <w:r>
+        <w:rPr>
+          <w:rStyle w:val="VerbatimChar"/>
+        </w:rPr>
+        <w:t xml:space="preserve">component_f_feeder/app.py:117,40,58-60</w:t>
+      </w:r>
+      <w:r>
+        <w:t xml:space="preserve">), reaching only the top few thousand awards</w:t>
+      </w:r>
+      <w:r>
+        <w:t xml:space="preserve"> </w:t>
+      </w:r>
+      <w:r>
+        <w:t xml:space="preserve">(~$13M floor at page 450) — the largest primes, where improper payments are least likely.</w:t>
+      </w:r>
+      <w:r>
+        <w:t xml:space="preserve"> </w:t>
+      </w:r>
+      <w:r>
+        <w:t xml:space="preserve">It is structurally blind to the small awards to small vendors where debarred parties</w:t>
+      </w:r>
+      <w:r>
+        <w:t xml:space="preserve"> </w:t>
+      </w:r>
+      <w:r>
+        <w:t xml:space="preserve">concentrate. The one real SAM overlap (</w:t>
+      </w:r>
+      <w:r>
+        <w:rPr>
+          <w:rStyle w:val="VerbatimChar"/>
+        </w:rPr>
+        <w:t xml:space="preserve">Hawwk LLC</w:t>
+      </w:r>
+      <w:r>
+        <w:t xml:space="preserve">, ~$86K) is caught when fed directly but</w:t>
+      </w:r>
+      <w:r>
+        <w:t xml:space="preserve"> </w:t>
+      </w:r>
+      <w:r>
+        <w:t xml:space="preserve">below the feed floor. Matcher is not at fault; the data path points away from the target</w:t>
+      </w:r>
+      <w:r>
+        <w:t xml:space="preserve"> </w:t>
+      </w:r>
+      <w:r>
+        <w:t xml:space="preserve">population (§4.1 row 16).</w:t>
+      </w:r>
+      <w:r>
+        <w:t xml:space="preserve"> </w:t>
+      </w:r>
+      <w:r>
+        <w:rPr>
+          <w:rStyle w:val="VerbatimChar"/>
+        </w:rPr>
+        <w:t xml:space="preserve">INJECTION_THREAT_MODEL.md</w:t>
+      </w:r>
+      <w:r>
+        <w:t xml:space="preserve"> </w:t>
+      </w:r>
+      <w:r>
+        <w:t xml:space="preserve">F7.</w:t>
+      </w:r>
+    </w:p>
+    <w:p>
       <w:r>
         <w:pict>
           <v:rect style="width:0;height:1.5pt" o:hralign="center" o:hrstd="t" o:hr="t"/>
         </w:pict>
       </w:r>
     </w:p>
-    <w:bookmarkEnd w:id="34"/>
-    <w:bookmarkStart w:id="35" w:name="recommended-follow-on-work"/>
+    <w:bookmarkEnd w:id="23"/>
+    <w:bookmarkStart w:id="24" w:name="recommended-follow-on-work"/>
     <w:p>
       <w:pPr>
         <w:pStyle w:val="Heading2"/>
@@ -6988,14 +7315,102 @@
       </w:r>
     </w:p>
     <w:p>
+      <w:pPr>
+        <w:pStyle w:val="Compact"/>
+        <w:numPr>
+          <w:ilvl w:val="0"/>
+          <w:numId w:val="1008"/>
+        </w:numPr>
+      </w:pPr>
+      <w:r>
+        <w:rPr>
+          <w:b/>
+          <w:bCs/>
+        </w:rPr>
+        <w:t xml:space="preserve">Amount-independent feed sampling (fixes F7)</w:t>
+      </w:r>
+      <w:r>
+        <w:t xml:space="preserve"> </w:t>
+      </w:r>
+      <w:r>
+        <w:t xml:space="preserve">and</w:t>
+      </w:r>
+      <w:r>
+        <w:t xml:space="preserve"> </w:t>
+      </w:r>
+      <w:r>
+        <w:rPr>
+          <w:b/>
+          <w:bCs/>
+        </w:rPr>
+        <w:t xml:space="preserve">real identifier ingestion</w:t>
+      </w:r>
+      <w:r>
+        <w:rPr>
+          <w:b/>
+          <w:bCs/>
+        </w:rPr>
+        <w:t xml:space="preserve"> </w:t>
+      </w:r>
+      <w:r>
+        <w:rPr>
+          <w:b/>
+          <w:bCs/>
+        </w:rPr>
+        <w:t xml:space="preserve">(addresses F6):</w:t>
+      </w:r>
+      <w:r>
+        <w:t xml:space="preserve"> </w:t>
+      </w:r>
+      <w:r>
+        <w:t xml:space="preserve">replace the amount-descending page walk with randomized or</w:t>
+      </w:r>
+      <w:r>
+        <w:t xml:space="preserve"> </w:t>
+      </w:r>
+      <w:r>
+        <w:t xml:space="preserve">amount-independent sampling across the full result set, or a small-award-focused pull, so</w:t>
+      </w:r>
+      <w:r>
+        <w:t xml:space="preserve"> </w:t>
+      </w:r>
+      <w:r>
+        <w:t xml:space="preserve">the feed can reach the small-vendor population where debarments concentrate; and ingest real</w:t>
+      </w:r>
+      <w:r>
+        <w:t xml:space="preserve"> </w:t>
+      </w:r>
+      <w:r>
+        <w:t xml:space="preserve">UEI/TIN with the reference data so identity-strong matches (and a real-entity</w:t>
+      </w:r>
+      <w:r>
+        <w:t xml:space="preserve"> </w:t>
+      </w:r>
+      <w:r>
+        <w:rPr>
+          <w:rStyle w:val="VerbatimChar"/>
+        </w:rPr>
+        <w:t xml:space="preserve">reject</w:t>
+      </w:r>
+      <w:r>
+        <w:t xml:space="preserve">) are</w:t>
+      </w:r>
+      <w:r>
+        <w:t xml:space="preserve"> </w:t>
+      </w:r>
+      <w:r>
+        <w:t xml:space="preserve">possible against real listed entities, not only synthetic seeds.</w:t>
+      </w:r>
+    </w:p>
+    <w:p>
       <w:r>
         <w:pict>
           <v:rect style="width:0;height:1.5pt" o:hralign="center" o:hrstd="t" o:hr="t"/>
         </w:pict>
       </w:r>
     </w:p>
-    <w:bookmarkEnd w:id="35"/>
-    <w:bookmarkStart w:id="36" w:name="X5cac89ab244092a7e7a5de90a2961e3117cd854"/>
+    <w:bookmarkEnd w:id="24"/>
+    <w:bookmarkStart w:id="25" w:name="X5cac89ab244092a7e7a5de90a2961e3117cd854"/>
     <w:p>
       <w:pPr>
         <w:pStyle w:val="Heading2"/>
@@ -7234,8 +7649,8 @@
         </w:pict>
       </w:r>
     </w:p>
-    <w:bookmarkEnd w:id="36"/>
-    <w:bookmarkStart w:id="37" w:name="X2fcbe66066c9d9c626d95b99e98c599412cdcce"/>
+    <w:bookmarkEnd w:id="25"/>
+    <w:bookmarkStart w:id="26" w:name="X2fcbe66066c9d9c626d95b99e98c599412cdcce"/>
     <w:p>
       <w:pPr>
         <w:pStyle w:val="Heading2"/>
@@ -7427,8 +7842,8 @@
         </w:pict>
       </w:r>
     </w:p>
-    <w:bookmarkEnd w:id="37"/>
-    <w:bookmarkStart w:id="38" w:name="X32313d1303202d4c90c0cc2d55af1bf5904562e"/>
+    <w:bookmarkEnd w:id="26"/>
+    <w:bookmarkStart w:id="27" w:name="X32313d1303202d4c90c0cc2d55af1bf5904562e"/>
     <w:p>
       <w:pPr>
         <w:pStyle w:val="Heading2"/>
@@ -7529,13 +7944,7 @@
         <w:t xml:space="preserve"> </w:t>
       </w:r>
       <w:r>
-        <w:t xml:space="preserve">“</w:t>
-      </w:r>
-      <w:r>
-        <w:t xml:space="preserve">active</w:t>
-      </w:r>
-      <w:r>
-        <w:t xml:space="preserve">”</w:t>
+        <w:t xml:space="preserve">“active”</w:t>
       </w:r>
       <w:r>
         <w:t xml:space="preserve"> </w:t>
@@ -7547,13 +7956,7 @@
         <w:t xml:space="preserve"> </w:t>
       </w:r>
       <w:r>
-        <w:t xml:space="preserve">“</w:t>
-      </w:r>
-      <w:r>
-        <w:t xml:space="preserve">Inactive</w:t>
-      </w:r>
-      <w:r>
-        <w:t xml:space="preserve">”</w:t>
+        <w:t xml:space="preserve">“Inactive”</w:t>
       </w:r>
       <w:r>
         <w:t xml:space="preserve">, caught by a test).</w:t>
@@ -7584,8 +7987,8 @@
         </w:pict>
       </w:r>
     </w:p>
-    <w:bookmarkEnd w:id="38"/>
-    <w:bookmarkStart w:id="39" w:name="appendix-a-raw-scan-output"/>
+    <w:bookmarkEnd w:id="27"/>
+    <w:bookmarkStart w:id="28" w:name="appendix-a-raw-scan-output"/>
     <w:p>
       <w:pPr>
         <w:pStyle w:val="Heading2"/>
@@ -7812,8 +8215,8 @@
         <w:t xml:space="preserve">.)</w:t>
       </w:r>
     </w:p>
-    <w:bookmarkEnd w:id="39"/>
-    <w:bookmarkStart w:id="40" w:name="appendix-b-evidence-decisions"/>
+    <w:bookmarkEnd w:id="28"/>
+    <w:bookmarkStart w:id="29" w:name="appendix-b-evidence-decisions"/>
     <w:p>
       <w:pPr>
         <w:pStyle w:val="Heading2"/>
@@ -7977,9 +8380,13 @@
         <w:t xml:space="preserve">refresh; regenerate it from this Markdown before final submission.</w:t>
       </w:r>
     </w:p>
-    <w:bookmarkEnd w:id="40"/>
-    <w:bookmarkEnd w:id="41"/>
-    <w:sectPr/>
+    <w:bookmarkEnd w:id="29"/>
+    <w:bookmarkEnd w:id="30"/>
+    <w:sectPr>
+      <w:footnotePr>
+        <w:numRestart w:val="eachSect"/>
+      </w:footnotePr>
+    </w:sectPr>
   </w:body>
 </w:document>
 </file>
@@ -8365,10 +8772,10 @@
   <w:docDefaults>
     <w:rPrDefault>
       <w:rPr>
-        <w:rFonts w:asciiTheme="minorHAnsi" w:cstheme="minorBidi" w:eastAsiaTheme="minorHAnsi" w:hAnsiTheme="minorHAnsi"/>
+        <w:rFonts w:asciiTheme="minorHAnsi" w:cstheme="minorBidi" w:eastAsiaTheme="minorEastAsia" w:hAnsiTheme="minorHAnsi"/>
         <w:sz w:val="24"/>
         <w:szCs w:val="24"/>
-        <w:lang w:bidi="ar-SA" w:eastAsia="en-US" w:val="en-US"/>
+        <w:lang w:bidi="ar-SA" w:eastAsia="zh-CN" w:val="en-US"/>
       </w:rPr>
     </w:rPrDefault>
     <w:pPrDefault>
@@ -8420,8 +8827,6 @@
     </w:pPr>
     <w:rPr>
       <w:rFonts w:asciiTheme="majorHAnsi" w:cstheme="majorBidi" w:eastAsiaTheme="majorEastAsia" w:hAnsiTheme="majorHAnsi"/>
-      <w:spacing w:val="-10"/>
-      <w:kern w:val="28"/>
       <w:sz w:val="56"/>
       <w:szCs w:val="56"/>
     </w:rPr>
@@ -8434,15 +8839,13 @@
     <w:rsid w:val="00A10FD9"/>
     <w:rPr>
       <w:rFonts w:asciiTheme="majorHAnsi" w:cstheme="majorBidi" w:eastAsiaTheme="majorEastAsia" w:hAnsiTheme="majorHAnsi"/>
-      <w:spacing w:val="-10"/>
-      <w:kern w:val="28"/>
       <w:sz w:val="56"/>
       <w:szCs w:val="56"/>
     </w:rPr>
   </w:style>
   <w:style w:styleId="Subtitle" w:type="paragraph">
     <w:name w:val="Subtitle"/>
-    <w:basedOn w:val="Normal"/>
+    <w:basedOn w:val="Title"/>
     <w:next w:val="BodyText"/>
     <w:link w:val="SubtitleChar"/>
     <w:uiPriority w:val="11"/>
@@ -8455,7 +8858,6 @@
     </w:pPr>
     <w:rPr>
       <w:rFonts w:cstheme="majorBidi" w:eastAsiaTheme="majorEastAsia"/>
-      <w:color w:themeColor="text1" w:themeTint="A6" w:val="595959"/>
       <w:spacing w:val="15"/>
       <w:sz w:val="28"/>
       <w:szCs w:val="28"/>
@@ -8477,23 +8879,31 @@
   </w:style>
   <w:style w:customStyle="1" w:styleId="Author" w:type="paragraph">
     <w:name w:val="Author"/>
+    <w:basedOn w:val="Title"/>
     <w:next w:val="BodyText"/>
     <w:qFormat/>
     <w:pPr>
       <w:keepNext/>
       <w:keepLines/>
-      <w:jc w:val="center"/>
     </w:pPr>
+    <w:rPr>
+      <w:sz w:val="24"/>
+      <w:szCs w:val="24"/>
+    </w:rPr>
   </w:style>
   <w:style w:styleId="Date" w:type="paragraph">
     <w:name w:val="Date"/>
+    <w:basedOn w:val="Title"/>
     <w:next w:val="BodyText"/>
     <w:qFormat/>
     <w:pPr>
       <w:keepNext/>
       <w:keepLines/>
-      <w:jc w:val="center"/>
     </w:pPr>
+    <w:rPr>
+      <w:sz w:val="24"/>
+      <w:szCs w:val="24"/>
+    </w:rPr>
   </w:style>
   <w:style w:customStyle="1" w:styleId="AbstractTitle" w:type="paragraph">
     <w:name w:val="Abstract Title"/>
@@ -8508,7 +8918,6 @@
     </w:pPr>
     <w:rPr>
       <w:b/>
-      <w:color w:val="345A8A"/>
       <w:sz w:val="20"/>
       <w:szCs w:val="20"/>
     </w:rPr>
@@ -8907,13 +9316,6 @@
       </w:tblCellMar>
     </w:tblPr>
     <w:tblStylePr w:type="firstRow">
-      <w:tblPr>
-        <w:jc w:val="left"/>
-        <w:tblInd w:type="dxa" w:w="0"/>
-      </w:tblPr>
-      <w:trPr>
-        <w:jc w:val="left"/>
-      </w:trPr>
       <w:tcPr>
         <w:tcBorders>
           <w:bottom w:val="single"/>

</xml_diff>